<commit_message>
Update CV: add portfolio link, QR code, compact to 1 page
</commit_message>
<xml_diff>
--- a/Benard_Scott_CV.docx
+++ b/Benard_Scott_CV.docx
@@ -4,7 +4,7 @@
   <w:body>
     <w:p>
       <w:pPr>
-        <w:spacing w:after="60"/>
+        <w:spacing w:after="20" w:before="0" w:line="240" w:lineRule="auto"/>
         <w:jc w:val="center"/>
       </w:pPr>
       <w:r>
@@ -12,7 +12,7 @@
           <w:b/>
           <w:bCs/>
           <w:spacing w:val="60"/>
-          <w:sz w:val="56"/>
+          <w:sz w:val="40"/>
           <w:szCs w:val="56"/>
         </w:rPr>
         <w:t>BENARD SCOTT</w:t>
@@ -20,14 +20,14 @@
     </w:p>
     <w:p>
       <w:pPr>
-        <w:spacing w:after="40"/>
+        <w:spacing w:after="20" w:before="0" w:line="240" w:lineRule="auto"/>
         <w:jc w:val="center"/>
       </w:pPr>
       <w:r>
         <w:rPr>
           <w:i/>
           <w:iCs/>
-          <w:sz w:val="26"/>
+          <w:sz w:val="22"/>
           <w:szCs w:val="26"/>
         </w:rPr>
         <w:t>Academic Writer</w:t>
@@ -35,18 +35,27 @@
     </w:p>
     <w:p>
       <w:pPr>
-        <w:spacing w:after="60"/>
+        <w:spacing w:after="40" w:before="0" w:line="240" w:lineRule="auto"/>
         <w:jc w:val="center"/>
       </w:pPr>
       <w:r>
-        <w:t xml:space="preserve">benardscott@proton.me  |  </w:t>
-      </w:r>
-      <w:r>
-        <w:t xml:space="preserve">California </w:t>
-      </w:r>
-      <w:r>
-        <w:t xml:space="preserve">  |  [Portfolio Link]</w:t>
-      </w:r>
+        <w:rPr>
+          <w:sz w:val="20"/>
+        </w:rPr>
+        <w:t xml:space="preserve">benardscott@proton.me  |  California  |  </w:t>
+      </w:r>
+      <w:hyperlink r:id="rId7">
+        <w:r>
+          <w:rPr>
+            <w:rStyle w:val="Hyperlink"/>
+            <w:color w:val="0563C1"/>
+            <w:u w:val="single"/>
+            <w:sz w:val="20"/>
+            <w:szCs w:val="20"/>
+          </w:rPr>
+          <w:t xml:space="preserve">Portfolio</w:t>
+        </w:r>
+      </w:hyperlink>
     </w:p>
     <w:p>
       <w:pPr>
@@ -54,14 +63,14 @@
         <w:pBdr>
           <w:bottom w:val="single" w:sz="8" w:space="2" w:color="000000"/>
         </w:pBdr>
-        <w:spacing w:before="240" w:after="100"/>
+        <w:spacing w:before="120" w:after="60" w:line="240" w:lineRule="auto"/>
       </w:pPr>
       <w:r>
         <w:rPr>
           <w:b/>
           <w:bCs/>
           <w:spacing w:val="30"/>
-          <w:sz w:val="23"/>
+          <w:sz w:val="21"/>
           <w:szCs w:val="23"/>
         </w:rPr>
         <w:t>PROFESSIONAL SUMMARY</w:t>
@@ -69,10 +78,13 @@
     </w:p>
     <w:p>
       <w:pPr>
-        <w:spacing w:after="40"/>
+        <w:spacing w:after="20" w:before="0" w:line="240" w:lineRule="auto"/>
         <w:jc w:val="both"/>
       </w:pPr>
       <w:r>
+        <w:rPr>
+          <w:sz w:val="18"/>
+        </w:rPr>
         <w:t>Academic writer with a BSc in Information Technology and more than three years of freelance experience, working since 2023 on online writing platforms. Skilled in researching, structuring and editing academic content to a client's brief and deadline. Combines strong written communication with technical and design skills, and a background in IT support.</w:t>
       </w:r>
     </w:p>
@@ -82,14 +94,14 @@
         <w:pBdr>
           <w:bottom w:val="single" w:sz="8" w:space="2" w:color="000000"/>
         </w:pBdr>
-        <w:spacing w:before="240" w:after="100"/>
+        <w:spacing w:before="120" w:after="60" w:line="240" w:lineRule="auto"/>
       </w:pPr>
       <w:r>
         <w:rPr>
           <w:b/>
           <w:bCs/>
           <w:spacing w:val="30"/>
-          <w:sz w:val="23"/>
+          <w:sz w:val="21"/>
           <w:szCs w:val="23"/>
         </w:rPr>
         <w:t>CORE SKILLS</w:t>
@@ -102,9 +114,12 @@
           <w:ilvl w:val="0"/>
           <w:numId w:val="2"/>
         </w:numPr>
-        <w:spacing w:after="30"/>
-      </w:pPr>
-      <w:r>
+        <w:spacing w:after="0" w:before="0" w:line="240" w:lineRule="auto"/>
+      </w:pPr>
+      <w:r>
+        <w:rPr>
+          <w:sz w:val="18"/>
+        </w:rPr>
         <w:t>Academic writing: essays, research papers, reports, case studies and literature reviews</w:t>
       </w:r>
     </w:p>
@@ -115,9 +130,12 @@
           <w:ilvl w:val="0"/>
           <w:numId w:val="2"/>
         </w:numPr>
-        <w:spacing w:after="30"/>
-      </w:pPr>
-      <w:r>
+        <w:spacing w:after="0" w:before="0" w:line="240" w:lineRule="auto"/>
+      </w:pPr>
+      <w:r>
+        <w:rPr>
+          <w:sz w:val="18"/>
+        </w:rPr>
         <w:t>Research: locating, evaluating and synthesizing credible scholarly sources</w:t>
       </w:r>
     </w:p>
@@ -128,9 +146,12 @@
           <w:ilvl w:val="0"/>
           <w:numId w:val="2"/>
         </w:numPr>
-        <w:spacing w:after="30"/>
-      </w:pPr>
-      <w:r>
+        <w:spacing w:after="0" w:before="0" w:line="240" w:lineRule="auto"/>
+      </w:pPr>
+      <w:r>
+        <w:rPr>
+          <w:sz w:val="18"/>
+        </w:rPr>
         <w:t>Referencing: APA, MLA, Harvard, Chicago and other citation styles</w:t>
       </w:r>
     </w:p>
@@ -141,9 +162,12 @@
           <w:ilvl w:val="0"/>
           <w:numId w:val="2"/>
         </w:numPr>
-        <w:spacing w:after="30"/>
-      </w:pPr>
-      <w:r>
+        <w:spacing w:after="0" w:before="0" w:line="240" w:lineRule="auto"/>
+      </w:pPr>
+      <w:r>
+        <w:rPr>
+          <w:sz w:val="18"/>
+        </w:rPr>
         <w:t>Editing and proofreading: grammar, structure, clarity and consistency</w:t>
       </w:r>
     </w:p>
@@ -154,9 +178,12 @@
           <w:ilvl w:val="0"/>
           <w:numId w:val="2"/>
         </w:numPr>
-        <w:spacing w:after="30"/>
-      </w:pPr>
-      <w:r>
+        <w:spacing w:after="0" w:before="0" w:line="240" w:lineRule="auto"/>
+      </w:pPr>
+      <w:r>
+        <w:rPr>
+          <w:sz w:val="18"/>
+        </w:rPr>
         <w:t>Plagiarism awareness: original writing, correct attribution and paraphrasing</w:t>
       </w:r>
     </w:p>
@@ -167,9 +194,12 @@
           <w:ilvl w:val="0"/>
           <w:numId w:val="2"/>
         </w:numPr>
-        <w:spacing w:after="30"/>
-      </w:pPr>
-      <w:r>
+        <w:spacing w:after="0" w:before="0" w:line="240" w:lineRule="auto"/>
+      </w:pPr>
+      <w:r>
+        <w:rPr>
+          <w:sz w:val="18"/>
+        </w:rPr>
         <w:t>Time management: meeting client deadlines across multiple concurrent orders</w:t>
       </w:r>
     </w:p>
@@ -180,9 +210,12 @@
           <w:ilvl w:val="0"/>
           <w:numId w:val="2"/>
         </w:numPr>
-        <w:spacing w:after="30"/>
-      </w:pPr>
-      <w:r>
+        <w:spacing w:after="0" w:before="0" w:line="240" w:lineRule="auto"/>
+      </w:pPr>
+      <w:r>
+        <w:rPr>
+          <w:sz w:val="18"/>
+        </w:rPr>
         <w:t>Client communication: following briefs, handling revisions and giving updates</w:t>
       </w:r>
     </w:p>
@@ -193,9 +226,12 @@
           <w:ilvl w:val="0"/>
           <w:numId w:val="2"/>
         </w:numPr>
-        <w:spacing w:after="30"/>
-      </w:pPr>
-      <w:r>
+        <w:spacing w:after="0" w:before="0" w:line="240" w:lineRule="auto"/>
+      </w:pPr>
+      <w:r>
+        <w:rPr>
+          <w:sz w:val="18"/>
+        </w:rPr>
         <w:t>Technology: IT troubleshooting, Microsoft Office, Google Workspace</w:t>
       </w:r>
     </w:p>
@@ -205,14 +241,14 @@
         <w:pBdr>
           <w:bottom w:val="single" w:sz="8" w:space="2" w:color="000000"/>
         </w:pBdr>
-        <w:spacing w:before="240" w:after="100"/>
+        <w:spacing w:before="120" w:after="60" w:line="240" w:lineRule="auto"/>
       </w:pPr>
       <w:r>
         <w:rPr>
           <w:b/>
           <w:bCs/>
           <w:spacing w:val="30"/>
-          <w:sz w:val="23"/>
+          <w:sz w:val="21"/>
           <w:szCs w:val="23"/>
         </w:rPr>
         <w:t>PROFESSIONAL EXPERIENCE</w:t>
@@ -224,22 +260,27 @@
         <w:tabs>
           <w:tab w:val="right" w:pos="10080"/>
         </w:tabs>
-        <w:spacing w:before="120"/>
+        <w:spacing w:before="60" w:after="0" w:line="240" w:lineRule="auto"/>
       </w:pPr>
       <w:r>
         <w:rPr>
           <w:b/>
           <w:bCs/>
+          <w:sz w:val="19"/>
         </w:rPr>
         <w:t>Freelance Academic Writer</w:t>
       </w:r>
       <w:r>
+        <w:rPr>
+          <w:sz w:val="19"/>
+        </w:rPr>
         <w:tab/>
       </w:r>
       <w:r>
         <w:rPr>
           <w:b/>
           <w:bCs/>
+          <w:sz w:val="19"/>
         </w:rPr>
         <w:t>2023 – Present</w:t>
       </w:r>
@@ -247,12 +288,13 @@
     <w:p>
       <w:pPr>
         <w:keepNext/>
-        <w:spacing w:after="40"/>
+        <w:spacing w:after="0" w:before="60" w:line="240" w:lineRule="auto"/>
       </w:pPr>
       <w:r>
         <w:rPr>
           <w:i/>
           <w:iCs/>
+          <w:sz w:val="19"/>
         </w:rPr>
         <w:t>Online Freelance Platforms</w:t>
       </w:r>
@@ -260,13 +302,13 @@
     <w:p>
       <w:pPr>
         <w:keepNext/>
-        <w:spacing w:before="40" w:after="30"/>
+        <w:spacing w:before="60" w:after="0" w:line="240" w:lineRule="auto"/>
       </w:pPr>
       <w:r>
         <w:rPr>
           <w:b/>
           <w:bCs/>
-          <w:sz w:val="21"/>
+          <w:sz w:val="19"/>
           <w:szCs w:val="21"/>
         </w:rPr>
         <w:t>Duties and Responsibilities</w:t>
@@ -279,9 +321,12 @@
           <w:ilvl w:val="0"/>
           <w:numId w:val="2"/>
         </w:numPr>
-        <w:spacing w:after="30"/>
-      </w:pPr>
-      <w:r>
+        <w:spacing w:after="0" w:before="0" w:line="240" w:lineRule="auto"/>
+      </w:pPr>
+      <w:r>
+        <w:rPr>
+          <w:sz w:val="18"/>
+        </w:rPr>
         <w:t>Write original, well-researched essays, research papers, reports, case studies and literature reviews for clients across a range of subjects</w:t>
       </w:r>
     </w:p>
@@ -292,9 +337,12 @@
           <w:ilvl w:val="0"/>
           <w:numId w:val="2"/>
         </w:numPr>
-        <w:spacing w:after="30"/>
-      </w:pPr>
-      <w:r>
+        <w:spacing w:after="0" w:before="0" w:line="240" w:lineRule="auto"/>
+      </w:pPr>
+      <w:r>
+        <w:rPr>
+          <w:sz w:val="18"/>
+        </w:rPr>
         <w:t>Read and interpret assignment briefs, grading rubrics and formatting requirements before starting each order</w:t>
       </w:r>
     </w:p>
@@ -305,9 +353,12 @@
           <w:ilvl w:val="0"/>
           <w:numId w:val="2"/>
         </w:numPr>
-        <w:spacing w:after="30"/>
-      </w:pPr>
-      <w:r>
+        <w:spacing w:after="0" w:before="0" w:line="240" w:lineRule="auto"/>
+      </w:pPr>
+      <w:r>
+        <w:rPr>
+          <w:sz w:val="18"/>
+        </w:rPr>
         <w:t>Research, evaluate and select credible scholarly sources to support arguments and findings</w:t>
       </w:r>
     </w:p>
@@ -318,9 +369,12 @@
           <w:ilvl w:val="0"/>
           <w:numId w:val="2"/>
         </w:numPr>
-        <w:spacing w:after="30"/>
-      </w:pPr>
-      <w:r>
+        <w:spacing w:after="0" w:before="0" w:line="240" w:lineRule="auto"/>
+      </w:pPr>
+      <w:r>
+        <w:rPr>
+          <w:sz w:val="18"/>
+        </w:rPr>
         <w:t>Plan and structure each paper with a clear thesis, logical flow and a strong conclusion</w:t>
       </w:r>
     </w:p>
@@ -331,9 +385,12 @@
           <w:ilvl w:val="0"/>
           <w:numId w:val="2"/>
         </w:numPr>
-        <w:spacing w:after="30"/>
-      </w:pPr>
-      <w:r>
+        <w:spacing w:after="0" w:before="0" w:line="240" w:lineRule="auto"/>
+      </w:pPr>
+      <w:r>
+        <w:rPr>
+          <w:sz w:val="18"/>
+        </w:rPr>
         <w:t>Apply APA, MLA, Harvard, Chicago and other citation styles accurately, including in-text citations and reference lists</w:t>
       </w:r>
     </w:p>
@@ -344,9 +401,12 @@
           <w:ilvl w:val="0"/>
           <w:numId w:val="2"/>
         </w:numPr>
-        <w:spacing w:after="30"/>
-      </w:pPr>
-      <w:r>
+        <w:spacing w:after="0" w:before="0" w:line="240" w:lineRule="auto"/>
+      </w:pPr>
+      <w:r>
+        <w:rPr>
+          <w:sz w:val="18"/>
+        </w:rPr>
         <w:t>Paraphrase and attribute sources correctly to keep every paper original and free of plagiarism</w:t>
       </w:r>
     </w:p>
@@ -357,9 +417,12 @@
           <w:ilvl w:val="0"/>
           <w:numId w:val="2"/>
         </w:numPr>
-        <w:spacing w:after="30"/>
-      </w:pPr>
-      <w:r>
+        <w:spacing w:after="0" w:before="0" w:line="240" w:lineRule="auto"/>
+      </w:pPr>
+      <w:r>
+        <w:rPr>
+          <w:sz w:val="18"/>
+        </w:rPr>
         <w:t>Edit and proofread all work for grammar, clarity, consistency and formatting before delivery</w:t>
       </w:r>
     </w:p>
@@ -370,9 +433,12 @@
           <w:ilvl w:val="0"/>
           <w:numId w:val="2"/>
         </w:numPr>
-        <w:spacing w:after="30"/>
-      </w:pPr>
-      <w:r>
+        <w:spacing w:after="0" w:before="0" w:line="240" w:lineRule="auto"/>
+      </w:pPr>
+      <w:r>
+        <w:rPr>
+          <w:sz w:val="18"/>
+        </w:rPr>
         <w:t>Deliver orders on or before the deadline and apply client feedback in revisions promptly</w:t>
       </w:r>
     </w:p>
@@ -383,9 +449,12 @@
           <w:ilvl w:val="0"/>
           <w:numId w:val="2"/>
         </w:numPr>
-        <w:spacing w:after="30"/>
-      </w:pPr>
-      <w:r>
+        <w:spacing w:after="0" w:before="0" w:line="240" w:lineRule="auto"/>
+      </w:pPr>
+      <w:r>
+        <w:rPr>
+          <w:sz w:val="18"/>
+        </w:rPr>
         <w:t>Manage several orders at once, prioritizing by deadline and complexity</w:t>
       </w:r>
     </w:p>
@@ -396,9 +465,12 @@
           <w:ilvl w:val="0"/>
           <w:numId w:val="2"/>
         </w:numPr>
-        <w:spacing w:after="30"/>
-      </w:pPr>
-      <w:r>
+        <w:spacing w:after="0" w:before="0" w:line="240" w:lineRule="auto"/>
+      </w:pPr>
+      <w:r>
+        <w:rPr>
+          <w:sz w:val="18"/>
+        </w:rPr>
         <w:t>Communicate clearly with clients, confirm requirements and keep their information confidential</w:t>
       </w:r>
     </w:p>
@@ -408,22 +480,27 @@
         <w:tabs>
           <w:tab w:val="right" w:pos="10080"/>
         </w:tabs>
-        <w:spacing w:before="120"/>
+        <w:spacing w:before="60" w:after="0" w:line="240" w:lineRule="auto"/>
       </w:pPr>
       <w:r>
         <w:rPr>
           <w:b/>
           <w:bCs/>
+          <w:sz w:val="19"/>
         </w:rPr>
         <w:t>IT Support Technician</w:t>
       </w:r>
       <w:r>
+        <w:rPr>
+          <w:sz w:val="19"/>
+        </w:rPr>
         <w:tab/>
       </w:r>
       <w:r>
         <w:rPr>
           <w:b/>
           <w:bCs/>
+          <w:sz w:val="19"/>
         </w:rPr>
         <w:t>2023 – 2025</w:t>
       </w:r>
@@ -431,12 +508,13 @@
     <w:p>
       <w:pPr>
         <w:keepNext/>
-        <w:spacing w:after="40"/>
+        <w:spacing w:after="0" w:before="60" w:line="240" w:lineRule="auto"/>
       </w:pPr>
       <w:r>
         <w:rPr>
           <w:i/>
           <w:iCs/>
+          <w:sz w:val="19"/>
         </w:rPr>
         <w:t>Digital Cyber Cafe</w:t>
       </w:r>
@@ -444,13 +522,13 @@
     <w:p>
       <w:pPr>
         <w:keepNext/>
-        <w:spacing w:before="40" w:after="30"/>
+        <w:spacing w:before="60" w:after="0" w:line="240" w:lineRule="auto"/>
       </w:pPr>
       <w:r>
         <w:rPr>
           <w:b/>
           <w:bCs/>
-          <w:sz w:val="21"/>
+          <w:sz w:val="19"/>
           <w:szCs w:val="21"/>
         </w:rPr>
         <w:t>Duties and Responsibilities</w:t>
@@ -463,9 +541,12 @@
           <w:ilvl w:val="0"/>
           <w:numId w:val="2"/>
         </w:numPr>
-        <w:spacing w:after="30"/>
-      </w:pPr>
-      <w:r>
+        <w:spacing w:after="0" w:before="0" w:line="240" w:lineRule="auto"/>
+      </w:pPr>
+      <w:r>
+        <w:rPr>
+          <w:sz w:val="18"/>
+        </w:rPr>
         <w:t>Provided front-line technical support to customers and staff on computers, software and network connections</w:t>
       </w:r>
     </w:p>
@@ -476,9 +557,12 @@
           <w:ilvl w:val="0"/>
           <w:numId w:val="2"/>
         </w:numPr>
-        <w:spacing w:after="30"/>
-      </w:pPr>
-      <w:r>
+        <w:spacing w:after="0" w:before="0" w:line="240" w:lineRule="auto"/>
+      </w:pPr>
+      <w:r>
+        <w:rPr>
+          <w:sz w:val="18"/>
+        </w:rPr>
         <w:t>Diagnosed and resolved hardware, software and connectivity faults to keep workstations running</w:t>
       </w:r>
     </w:p>
@@ -489,9 +573,12 @@
           <w:ilvl w:val="0"/>
           <w:numId w:val="2"/>
         </w:numPr>
-        <w:spacing w:after="30"/>
-      </w:pPr>
-      <w:r>
+        <w:spacing w:after="0" w:before="0" w:line="240" w:lineRule="auto"/>
+      </w:pPr>
+      <w:r>
+        <w:rPr>
+          <w:sz w:val="18"/>
+        </w:rPr>
         <w:t>Installed, updated and maintained operating systems, applications and antivirus software</w:t>
       </w:r>
     </w:p>
@@ -502,9 +589,12 @@
           <w:ilvl w:val="0"/>
           <w:numId w:val="2"/>
         </w:numPr>
-        <w:spacing w:after="30"/>
-      </w:pPr>
-      <w:r>
+        <w:spacing w:after="0" w:before="0" w:line="240" w:lineRule="auto"/>
+      </w:pPr>
+      <w:r>
+        <w:rPr>
+          <w:sz w:val="18"/>
+        </w:rPr>
         <w:t>Assisted customers with online tasks, document typing, formatting, printing, scanning and file transfers</w:t>
       </w:r>
     </w:p>
@@ -515,9 +605,12 @@
           <w:ilvl w:val="0"/>
           <w:numId w:val="2"/>
         </w:numPr>
-        <w:spacing w:after="30"/>
-      </w:pPr>
-      <w:r>
+        <w:spacing w:after="0" w:before="0" w:line="240" w:lineRule="auto"/>
+      </w:pPr>
+      <w:r>
+        <w:rPr>
+          <w:sz w:val="18"/>
+        </w:rPr>
         <w:t>Set up and monitored workstations, printers and network equipment at the start and end of each day</w:t>
       </w:r>
     </w:p>
@@ -528,9 +621,12 @@
           <w:ilvl w:val="0"/>
           <w:numId w:val="2"/>
         </w:numPr>
-        <w:spacing w:after="30"/>
-      </w:pPr>
-      <w:r>
+        <w:spacing w:after="0" w:before="0" w:line="240" w:lineRule="auto"/>
+      </w:pPr>
+      <w:r>
+        <w:rPr>
+          <w:sz w:val="18"/>
+        </w:rPr>
         <w:t>Maintained a clean, organized and secure working environment for equipment and customer data</w:t>
       </w:r>
     </w:p>
@@ -541,9 +637,12 @@
           <w:ilvl w:val="0"/>
           <w:numId w:val="2"/>
         </w:numPr>
-        <w:spacing w:after="30"/>
-      </w:pPr>
-      <w:r>
+        <w:spacing w:after="0" w:before="0" w:line="240" w:lineRule="auto"/>
+      </w:pPr>
+      <w:r>
+        <w:rPr>
+          <w:sz w:val="18"/>
+        </w:rPr>
         <w:t>Advised customers on safe internet use and basic computer skills</w:t>
       </w:r>
     </w:p>
@@ -554,9 +653,12 @@
           <w:ilvl w:val="0"/>
           <w:numId w:val="2"/>
         </w:numPr>
-        <w:spacing w:after="30"/>
-      </w:pPr>
-      <w:r>
+        <w:spacing w:after="0" w:before="0" w:line="240" w:lineRule="auto"/>
+      </w:pPr>
+      <w:r>
+        <w:rPr>
+          <w:sz w:val="18"/>
+        </w:rPr>
         <w:lastRenderedPageBreak/>
         <w:t>Handled customer inquiries and payments professionally in a busy, service-focused environment</w:t>
       </w:r>
@@ -568,9 +670,12 @@
           <w:ilvl w:val="0"/>
           <w:numId w:val="2"/>
         </w:numPr>
-        <w:spacing w:after="30"/>
-      </w:pPr>
-      <w:r>
+        <w:spacing w:after="0" w:before="0" w:line="240" w:lineRule="auto"/>
+      </w:pPr>
+      <w:r>
+        <w:rPr>
+          <w:sz w:val="18"/>
+        </w:rPr>
         <w:t>Reported recurring faults and kept simple records of equipment issues and repairs</w:t>
       </w:r>
     </w:p>
@@ -580,14 +685,14 @@
         <w:pBdr>
           <w:bottom w:val="single" w:sz="8" w:space="2" w:color="000000"/>
         </w:pBdr>
-        <w:spacing w:before="240" w:after="100"/>
+        <w:spacing w:before="120" w:after="60" w:line="240" w:lineRule="auto"/>
       </w:pPr>
       <w:r>
         <w:rPr>
           <w:b/>
           <w:bCs/>
           <w:spacing w:val="30"/>
-          <w:sz w:val="23"/>
+          <w:sz w:val="21"/>
           <w:szCs w:val="23"/>
         </w:rPr>
         <w:t>EDUCATION</w:t>
@@ -599,22 +704,27 @@
         <w:tabs>
           <w:tab w:val="right" w:pos="10080"/>
         </w:tabs>
-        <w:spacing w:before="120"/>
+        <w:spacing w:before="60" w:after="0" w:line="240" w:lineRule="auto"/>
       </w:pPr>
       <w:r>
         <w:rPr>
           <w:b/>
           <w:bCs/>
+          <w:sz w:val="19"/>
         </w:rPr>
         <w:t>Bachelor of Science in Information Technology</w:t>
       </w:r>
       <w:r>
+        <w:rPr>
+          <w:sz w:val="19"/>
+        </w:rPr>
         <w:tab/>
       </w:r>
       <w:r>
         <w:rPr>
           <w:b/>
           <w:bCs/>
+          <w:sz w:val="19"/>
         </w:rPr>
         <w:t>Graduated 2022</w:t>
       </w:r>
@@ -622,12 +732,13 @@
     <w:p>
       <w:pPr>
         <w:keepNext/>
-        <w:spacing w:after="40"/>
+        <w:spacing w:after="0" w:before="60" w:line="240" w:lineRule="auto"/>
       </w:pPr>
       <w:r>
         <w:rPr>
           <w:i/>
           <w:iCs/>
+          <w:sz w:val="19"/>
         </w:rPr>
         <w:t>Northwestern Polytechnic University</w:t>
       </w:r>
@@ -638,14 +749,14 @@
         <w:pBdr>
           <w:bottom w:val="single" w:sz="8" w:space="2" w:color="000000"/>
         </w:pBdr>
-        <w:spacing w:before="240" w:after="100"/>
+        <w:spacing w:before="120" w:after="60" w:line="240" w:lineRule="auto"/>
       </w:pPr>
       <w:r>
         <w:rPr>
           <w:b/>
           <w:bCs/>
           <w:spacing w:val="30"/>
-          <w:sz w:val="23"/>
+          <w:sz w:val="21"/>
           <w:szCs w:val="23"/>
         </w:rPr>
         <w:t>ADDITIONAL SKILLS</w:t>
@@ -658,9 +769,12 @@
           <w:ilvl w:val="0"/>
           <w:numId w:val="2"/>
         </w:numPr>
-        <w:spacing w:after="30"/>
-      </w:pPr>
-      <w:r>
+        <w:spacing w:after="0" w:before="0" w:line="240" w:lineRule="auto"/>
+      </w:pPr>
+      <w:r>
+        <w:rPr>
+          <w:sz w:val="18"/>
+        </w:rPr>
         <w:t>Graphic design: Adobe Photoshop, Adobe Illustrator, Canva</w:t>
       </w:r>
     </w:p>
@@ -671,15 +785,71 @@
           <w:ilvl w:val="0"/>
           <w:numId w:val="2"/>
         </w:numPr>
-        <w:spacing w:after="30"/>
-      </w:pPr>
-      <w:r>
+        <w:spacing w:after="0" w:before="0" w:line="240" w:lineRule="auto"/>
+      </w:pPr>
+      <w:r>
+        <w:rPr>
+          <w:sz w:val="18"/>
+        </w:rPr>
         <w:t>Web development: building responsive websites</w:t>
+      </w:r>
+    </w:p>
+    <w:p>
+      <w:pPr>
+        <w:spacing w:before="80" w:after="0" w:line="240" w:lineRule="auto"/>
+        <w:jc w:val="center"/>
+      </w:pPr>
+      <w:r>
+        <w:drawing>
+          <wp:inline xmlns:a="http://schemas.openxmlformats.org/drawingml/2006/main" xmlns:pic="http://schemas.openxmlformats.org/drawingml/2006/picture">
+            <wp:extent cx="731520" cy="731520"/>
+            <wp:docPr id="1" name="Picture 1"/>
+            <wp:cNvGraphicFramePr>
+              <a:graphicFrameLocks noChangeAspect="1"/>
+            </wp:cNvGraphicFramePr>
+            <a:graphic>
+              <a:graphicData uri="http://schemas.openxmlformats.org/drawingml/2006/picture">
+                <pic:pic>
+                  <pic:nvPicPr>
+                    <pic:cNvPr id="0" name="media_1793294135769_68642c73.png"/>
+                    <pic:cNvPicPr/>
+                  </pic:nvPicPr>
+                  <pic:blipFill>
+                    <a:blip r:embed="rId8"/>
+                    <a:stretch>
+                      <a:fillRect/>
+                    </a:stretch>
+                  </pic:blipFill>
+                  <pic:spPr>
+                    <a:xfrm>
+                      <a:off x="0" y="0"/>
+                      <a:ext cx="731520" cy="731520"/>
+                    </a:xfrm>
+                    <a:prstGeom prst="rect"/>
+                  </pic:spPr>
+                </pic:pic>
+              </a:graphicData>
+            </a:graphic>
+          </wp:inline>
+        </w:drawing>
+      </w:r>
+    </w:p>
+    <w:p>
+      <w:pPr>
+        <w:spacing w:before="0" w:after="0" w:line="240" w:lineRule="auto"/>
+        <w:jc w:val="center"/>
+      </w:pPr>
+      <w:r>
+        <w:rPr>
+          <w:i/>
+          <w:sz w:val="14"/>
+        </w:rPr>
+        <w:t>Scan to view portfolio</w:t>
       </w:r>
     </w:p>
     <w:sectPr>
       <w:pgSz w:w="12240" w:h="15840"/>
-      <w:pgMar w:top="1000" w:right="1080" w:bottom="1000" w:left="1080" w:header="708" w:footer="708" w:gutter="0"/>
+      <w:pgMar w:top="567" w:right="850" w:bottom="567" w:left="850" w:header="708" w:footer="708" w:gutter="0"/>
       <w:cols w:space="720"/>
       <w:docGrid w:linePitch="360"/>
     </w:sectPr>

</xml_diff>